<commit_message>
fix: preserve challenge prose formatting
</commit_message>
<xml_diff>
--- a/Mapped Curriculum Lesson - Supplemental Material/Grade 6/Lesson 01 - Hello Python!/Hello Python! - Worksheet.docx
+++ b/Mapped Curriculum Lesson - Supplemental Material/Grade 6/Lesson 01 - Hello Python!/Hello Python! - Worksheet.docx
@@ -1029,59 +1029,33 @@
         <w:rPr>
           <w:color w:val="080808"/>
         </w:rPr>
-        <w:t xml:space="preserve">Ask for a friend's name </w:t>
+        <w:t xml:space="preserve">Ask for a friend's name and store it in a variable called [friend_name]. Change </w:t>
+      </w:r>
+      <w:r>
+        <w:rPr>
+          <w:color w:val="1750EB"/>
+          <w:rFonts w:ascii="Consolas" w:hAnsi="Consolas"/>
+        </w:rPr>
+        <w:t>print()</w:t>
+      </w:r>
+      <w:r>
+        <w:rPr>
+          <w:color w:val="080808"/>
+        </w:rPr>
+        <w:t xml:space="preserve"> so it displays </w:t>
       </w:r>
       <w:r>
         <w:rPr>
           <w:color w:val="067D17"/>
           <w:rFonts w:ascii="Consolas" w:hAnsi="Consolas"/>
         </w:rPr>
-        <w:t>"and"</w:t>
-      </w:r>
-      <w:r>
-        <w:rPr>
-          <w:color w:val="080808"/>
-        </w:rPr>
-        <w:t xml:space="preserve"> store it in a variable called [friend_name]. Change </w:t>
-      </w:r>
-      <w:r>
-        <w:rPr>
-          <w:color w:val="1750EB"/>
-          <w:rFonts w:ascii="Consolas" w:hAnsi="Consolas"/>
-        </w:rPr>
-        <w:t>print()</w:t>
-      </w:r>
-      <w:r>
-        <w:rPr>
-          <w:color w:val="080808"/>
-        </w:rPr>
-        <w:t xml:space="preserve"> so it displays </w:t>
-      </w:r>
-      <w:r>
-        <w:rPr>
-          <w:color w:val="067D17"/>
-          <w:rFonts w:ascii="Consolas" w:hAnsi="Consolas"/>
-        </w:rPr>
         <w:t>"Hello, [name] and [friend_name]!"</w:t>
       </w:r>
       <w:r>
         <w:rPr>
           <w:color w:val="080808"/>
         </w:rPr>
-        <w:t xml:space="preserve"> using [name] </w:t>
-      </w:r>
-      <w:r>
-        <w:rPr>
-          <w:color w:val="067D17"/>
-          <w:rFonts w:ascii="Consolas" w:hAnsi="Consolas"/>
-        </w:rPr>
-        <w:t>"and"</w:t>
-      </w:r>
-      <w:r>
-        <w:rPr>
-          <w:color w:val="080808"/>
-        </w:rPr>
-        <w:t xml:space="preserve"> [friend_name].</w:t>
+        <w:t xml:space="preserve"> using [name] and [friend_name].</w:t>
       </w:r>
     </w:p>
     <w:p>

</xml_diff>

<commit_message>
feat: refresh challenge language and compile capstones
Rewrite all 99 compiled challenge prompts toward the target Python
Challenges style: task-first openers, one worked example, no test
scripts. Replace C1/C2 tasks that needed no real code change, resize
Make tasks, fix concept-budget breaches, and update 48 solutions.

Render [variable] markers as plum chips on a tinted background in
worksheets, PDFs and slides, including inside quoted output text.
Set inline code at 85% of body size so it matches Calibri, style
True/False/None, and use embedded JetBrains Mono for prose code.

Build the three capstones (L11, L27, L36) from curriculum/capstones.json
with worksheet styling, filled slide decks and checked solutions, and
verify them alongside the regular suite.

Co-Authored-By: Claude Opus 5.5 <noreply@anthropic.com>
</commit_message>
<xml_diff>
--- a/Mapped Curriculum Lesson - Supplemental Material/Grade 6/Lesson 01 - Hello Python!/Hello Python! - Worksheet.docx
+++ b/Mapped Curriculum Lesson - Supplemental Material/Grade 6/Lesson 01 - Hello Python!/Hello Python! - Worksheet.docx
@@ -914,12 +914,14 @@
         <w:rPr>
           <w:color w:val="080808"/>
         </w:rPr>
-        <w:t xml:space="preserve">Store a greeting from another language, such as </w:t>
+        <w:t xml:space="preserve">Change the example so it stores a greeting in another language, such as </w:t>
       </w:r>
       <w:r>
         <w:rPr>
           <w:color w:val="067D17"/>
-          <w:rFonts w:ascii="Consolas" w:hAnsi="Consolas"/>
+          <w:rFonts w:ascii="JetBrains Mono" w:hAnsi="JetBrains Mono"/>
+          <w:sz w:val="20"/>
+          <w:szCs w:val="20"/>
         </w:rPr>
         <w:t>"Xin chao"</w:t>
       </w:r>
@@ -927,12 +929,30 @@
         <w:rPr>
           <w:color w:val="080808"/>
         </w:rPr>
-        <w:t xml:space="preserve">, in a variable called [greeting]. Change </w:t>
+        <w:t xml:space="preserve">, in </w:t>
+      </w:r>
+      <w:r>
+        <w:rPr>
+          <w:color w:val="6A1B9A"/>
+          <w:rFonts w:ascii="JetBrains Mono" w:hAnsi="JetBrains Mono"/>
+          <w:sz w:val="20"/>
+          <w:szCs w:val="20"/>
+          <w:shd w:val="clear" w:color="auto" w:fill="ECEAF4"/>
+        </w:rPr>
+        <w:t> greeting </w:t>
+      </w:r>
+      <w:r>
+        <w:rPr>
+          <w:color w:val="080808"/>
+        </w:rPr>
+        <w:t xml:space="preserve">. Change </w:t>
       </w:r>
       <w:r>
         <w:rPr>
           <w:color w:val="1750EB"/>
-          <w:rFonts w:ascii="Consolas" w:hAnsi="Consolas"/>
+          <w:rFonts w:ascii="JetBrains Mono" w:hAnsi="JetBrains Mono"/>
+          <w:sz w:val="20"/>
+          <w:szCs w:val="20"/>
         </w:rPr>
         <w:t>print()</w:t>
       </w:r>
@@ -940,7 +960,54 @@
         <w:rPr>
           <w:color w:val="080808"/>
         </w:rPr>
-        <w:t xml:space="preserve"> so it displays [greeting], then [name], then an exclamation mark.</w:t>
+        <w:t xml:space="preserve"> to display </w:t>
+      </w:r>
+      <w:r>
+        <w:rPr>
+          <w:color w:val="6A1B9A"/>
+          <w:rFonts w:ascii="JetBrains Mono" w:hAnsi="JetBrains Mono"/>
+          <w:sz w:val="20"/>
+          <w:szCs w:val="20"/>
+          <w:shd w:val="clear" w:color="auto" w:fill="ECEAF4"/>
+        </w:rPr>
+        <w:t> greeting </w:t>
+      </w:r>
+      <w:r>
+        <w:rPr>
+          <w:color w:val="080808"/>
+        </w:rPr>
+        <w:t xml:space="preserve">, then </w:t>
+      </w:r>
+      <w:r>
+        <w:rPr>
+          <w:color w:val="6A1B9A"/>
+          <w:rFonts w:ascii="JetBrains Mono" w:hAnsi="JetBrains Mono"/>
+          <w:sz w:val="20"/>
+          <w:szCs w:val="20"/>
+          <w:shd w:val="clear" w:color="auto" w:fill="ECEAF4"/>
+        </w:rPr>
+        <w:t> name </w:t>
+      </w:r>
+      <w:r>
+        <w:rPr>
+          <w:color w:val="080808"/>
+        </w:rPr>
+        <w:t xml:space="preserve">, then </w:t>
+      </w:r>
+      <w:r>
+        <w:rPr>
+          <w:color w:val="067D17"/>
+          <w:rFonts w:ascii="JetBrains Mono" w:hAnsi="JetBrains Mono"/>
+          <w:sz w:val="20"/>
+          <w:szCs w:val="20"/>
+        </w:rPr>
+        <w:t>"!"</w:t>
+      </w:r>
+      <w:r>
+        <w:rPr>
+          <w:color w:val="080808"/>
+        </w:rPr>
+        <w:t>.</w:t>
       </w:r>
     </w:p>
     <w:p w14:noSpellErr="1">
@@ -1029,33 +1096,100 @@
         <w:rPr>
           <w:color w:val="080808"/>
         </w:rPr>
-        <w:t xml:space="preserve">Ask for a friend's name and store it in a variable called [friend_name]. Change </w:t>
-      </w:r>
-      <w:r>
-        <w:rPr>
-          <w:color w:val="1750EB"/>
-          <w:rFonts w:ascii="Consolas" w:hAnsi="Consolas"/>
-        </w:rPr>
-        <w:t>print()</w:t>
-      </w:r>
-      <w:r>
-        <w:rPr>
-          <w:color w:val="080808"/>
-        </w:rPr>
-        <w:t xml:space="preserve"> so it displays </w:t>
+        <w:t xml:space="preserve">Extend the example so it also asks for a friend's name and stores it in </w:t>
+      </w:r>
+      <w:r>
+        <w:rPr>
+          <w:color w:val="6A1B9A"/>
+          <w:rFonts w:ascii="JetBrains Mono" w:hAnsi="JetBrains Mono"/>
+          <w:sz w:val="20"/>
+          <w:szCs w:val="20"/>
+          <w:shd w:val="clear" w:color="auto" w:fill="ECEAF4"/>
+        </w:rPr>
+        <w:t> friend_name </w:t>
+      </w:r>
+      <w:r>
+        <w:rPr>
+          <w:color w:val="080808"/>
+        </w:rPr>
+        <w:t xml:space="preserve">. Display </w:t>
       </w:r>
       <w:r>
         <w:rPr>
           <w:color w:val="067D17"/>
-          <w:rFonts w:ascii="Consolas" w:hAnsi="Consolas"/>
-        </w:rPr>
-        <w:t>"Hello, [name] and [friend_name]!"</w:t>
-      </w:r>
-      <w:r>
-        <w:rPr>
-          <w:color w:val="080808"/>
-        </w:rPr>
-        <w:t xml:space="preserve"> using [name] and [friend_name].</w:t>
+          <w:rFonts w:ascii="JetBrains Mono" w:hAnsi="JetBrains Mono"/>
+          <w:sz w:val="20"/>
+          <w:szCs w:val="20"/>
+        </w:rPr>
+        <w:t>"Hello,"</w:t>
+      </w:r>
+      <w:r>
+        <w:rPr>
+          <w:color w:val="080808"/>
+        </w:rPr>
+        <w:t xml:space="preserve"> followed by </w:t>
+      </w:r>
+      <w:r>
+        <w:rPr>
+          <w:color w:val="6A1B9A"/>
+          <w:rFonts w:ascii="JetBrains Mono" w:hAnsi="JetBrains Mono"/>
+          <w:sz w:val="20"/>
+          <w:szCs w:val="20"/>
+          <w:shd w:val="clear" w:color="auto" w:fill="ECEAF4"/>
+        </w:rPr>
+        <w:t> name </w:t>
+      </w:r>
+      <w:r>
+        <w:rPr>
+          <w:color w:val="080808"/>
+        </w:rPr>
+        <w:t xml:space="preserve">, </w:t>
+      </w:r>
+      <w:r>
+        <w:rPr>
+          <w:color w:val="067D17"/>
+          <w:rFonts w:ascii="JetBrains Mono" w:hAnsi="JetBrains Mono"/>
+          <w:sz w:val="20"/>
+          <w:szCs w:val="20"/>
+        </w:rPr>
+        <w:t>"and"</w:t>
+      </w:r>
+      <w:r>
+        <w:rPr>
+          <w:color w:val="080808"/>
+        </w:rPr>
+        <w:t xml:space="preserve">, </w:t>
+      </w:r>
+      <w:r>
+        <w:rPr>
+          <w:color w:val="6A1B9A"/>
+          <w:rFonts w:ascii="JetBrains Mono" w:hAnsi="JetBrains Mono"/>
+          <w:sz w:val="20"/>
+          <w:szCs w:val="20"/>
+          <w:shd w:val="clear" w:color="auto" w:fill="ECEAF4"/>
+        </w:rPr>
+        <w:t> friend_name </w:t>
+      </w:r>
+      <w:r>
+        <w:rPr>
+          <w:color w:val="080808"/>
+        </w:rPr>
+        <w:t xml:space="preserve"> and </w:t>
+      </w:r>
+      <w:r>
+        <w:rPr>
+          <w:color w:val="067D17"/>
+          <w:rFonts w:ascii="JetBrains Mono" w:hAnsi="JetBrains Mono"/>
+          <w:sz w:val="20"/>
+          <w:szCs w:val="20"/>
+        </w:rPr>
+        <w:t>"!"</w:t>
+      </w:r>
+      <w:r>
+        <w:rPr>
+          <w:color w:val="080808"/>
+        </w:rPr>
+        <w:t>.</w:t>
       </w:r>
     </w:p>
     <w:p>
@@ -1082,20 +1216,92 @@
         <w:rPr>
           <w:color w:val="080808"/>
         </w:rPr>
-        <w:t xml:space="preserve">Create a new program that asks for two school subjects. Display the message </w:t>
+        <w:t xml:space="preserve">Create a program that asks for two school subjects and stores them in </w:t>
+      </w:r>
+      <w:r>
+        <w:rPr>
+          <w:color w:val="6A1B9A"/>
+          <w:rFonts w:ascii="JetBrains Mono" w:hAnsi="JetBrains Mono"/>
+          <w:sz w:val="20"/>
+          <w:szCs w:val="20"/>
+          <w:shd w:val="clear" w:color="auto" w:fill="ECEAF4"/>
+        </w:rPr>
+        <w:t> subject_1 </w:t>
+      </w:r>
+      <w:r>
+        <w:rPr>
+          <w:color w:val="080808"/>
+        </w:rPr>
+        <w:t xml:space="preserve"> and </w:t>
+      </w:r>
+      <w:r>
+        <w:rPr>
+          <w:color w:val="6A1B9A"/>
+          <w:rFonts w:ascii="JetBrains Mono" w:hAnsi="JetBrains Mono"/>
+          <w:sz w:val="20"/>
+          <w:szCs w:val="20"/>
+          <w:shd w:val="clear" w:color="auto" w:fill="ECEAF4"/>
+        </w:rPr>
+        <w:t> subject_2 </w:t>
+      </w:r>
+      <w:r>
+        <w:rPr>
+          <w:color w:val="080808"/>
+        </w:rPr>
+        <w:t xml:space="preserve">. Display </w:t>
       </w:r>
       <w:r>
         <w:rPr>
           <w:color w:val="067D17"/>
-          <w:rFonts w:ascii="Consolas" w:hAnsi="Consolas"/>
-        </w:rPr>
-        <w:t>"I think [subject 1] and [subject 2] are great subjects!"</w:t>
-      </w:r>
-      <w:r>
-        <w:rPr>
-          <w:color w:val="080808"/>
-        </w:rPr>
-        <w:t xml:space="preserve"> using the two answers.</w:t>
+          <w:rFonts w:ascii="JetBrains Mono" w:hAnsi="JetBrains Mono"/>
+          <w:sz w:val="20"/>
+          <w:szCs w:val="20"/>
+        </w:rPr>
+        <w:t xml:space="preserve">"I think </w:t>
+      </w:r>
+      <w:r>
+        <w:rPr>
+          <w:color w:val="6A1B9A"/>
+          <w:rFonts w:ascii="JetBrains Mono" w:hAnsi="JetBrains Mono"/>
+          <w:sz w:val="20"/>
+          <w:szCs w:val="20"/>
+          <w:shd w:val="clear" w:color="auto" w:fill="ECEAF4"/>
+        </w:rPr>
+        <w:t> subject_1 </w:t>
+      </w:r>
+      <w:r>
+        <w:rPr>
+          <w:color w:val="067D17"/>
+          <w:rFonts w:ascii="JetBrains Mono" w:hAnsi="JetBrains Mono"/>
+          <w:sz w:val="20"/>
+          <w:szCs w:val="20"/>
+        </w:rPr>
+        <w:t xml:space="preserve"> and </w:t>
+      </w:r>
+      <w:r>
+        <w:rPr>
+          <w:color w:val="6A1B9A"/>
+          <w:rFonts w:ascii="JetBrains Mono" w:hAnsi="JetBrains Mono"/>
+          <w:sz w:val="20"/>
+          <w:szCs w:val="20"/>
+          <w:shd w:val="clear" w:color="auto" w:fill="ECEAF4"/>
+        </w:rPr>
+        <w:t> subject_2 </w:t>
+      </w:r>
+      <w:r>
+        <w:rPr>
+          <w:color w:val="067D17"/>
+          <w:rFonts w:ascii="JetBrains Mono" w:hAnsi="JetBrains Mono"/>
+          <w:sz w:val="20"/>
+          <w:szCs w:val="20"/>
+        </w:rPr>
+        <w:t xml:space="preserve"> are great subjects!"</w:t>
+      </w:r>
+      <w:r>
+        <w:rPr>
+          <w:color w:val="080808"/>
+        </w:rPr>
+        <w:t>.</w:t>
       </w:r>
     </w:p>
     <w:p>

</xml_diff>